<commit_message>
the student tail didn't run at all so, it has ran only for 0 fold have to figure out why
</commit_message>
<xml_diff>
--- a/backend-dev/REPORT.docx
+++ b/backend-dev/REPORT.docx
@@ -2313,7 +2313,7 @@
     </w:p>
     <w:bookmarkEnd w:id="17"/>
     <w:bookmarkEnd w:id="18"/>
-    <w:bookmarkStart w:id="23" w:name="results-in-detail"/>
+    <w:bookmarkStart w:id="24" w:name="results-in-detail"/>
     <w:p>
       <w:pPr>
         <w:pStyle w:val="Heading1"/>
@@ -3100,7 +3100,7 @@
       </w:r>
     </w:p>
     <w:bookmarkEnd w:id="20"/>
-    <w:bookmarkStart w:id="21" w:name="annual-label-student-student_loyo.py"/>
+    <w:bookmarkStart w:id="22" w:name="annual-label-student-student_loyo.py"/>
     <w:p>
       <w:pPr>
         <w:pStyle w:val="Heading2"/>
@@ -3123,7 +3123,7 @@
         <w:pStyle w:val="FirstParagraph"/>
       </w:pPr>
       <w:r>
-        <w:t xml:space="preserve">This was the experimental track for the annual Ouest dataset described in the brief. Results were structurally compromised: with S2 only available from 2016-2018, LOYO produced 3 folds with heavily imbalanced sizes (216 vs 30,000 rows), and tail-strategy fails outright (training years 2013-2015 have no S2 data). Reported here for completeness:</w:t>
+        <w:t xml:space="preserve">This was the experimental track for the annual Ouest dataset described in the brief. Results were structurally compromised: with S2 only available from 2016-2018, LOYO produced 3 folds with heavily imbalanced sizes (216 vs 30,000 rows). The tail-strategy initially produced an empty report — diagnosed and fixed mid-build (see below). Reported here for completeness:</w:t>
       </w:r>
     </w:p>
     <w:tbl>
@@ -3288,45 +3288,138 @@
               <w:pStyle w:val="Compact"/>
             </w:pPr>
             <w:r>
-              <w:t xml:space="preserve">Tail (1 fold)</w:t>
-            </w:r>
-          </w:p>
-        </w:tc>
-        <w:tc>
-          <w:tcPr/>
-          <w:p>
-            <w:pPr>
-              <w:pStyle w:val="Compact"/>
-            </w:pPr>
-            <w:r>
-              <w:t xml:space="preserve">skipped</w:t>
-            </w:r>
-          </w:p>
-        </w:tc>
-        <w:tc>
-          <w:tcPr/>
-          <w:p>
-            <w:pPr>
-              <w:pStyle w:val="Compact"/>
-            </w:pPr>
-            <w:r>
-              <w:t xml:space="preserve">skipped</w:t>
-            </w:r>
-          </w:p>
-        </w:tc>
-        <w:tc>
-          <w:tcPr/>
-          <w:p>
-            <w:pPr>
-              <w:pStyle w:val="Compact"/>
-            </w:pPr>
-            <w:r>
-              <w:t xml:space="preserve">Train set empty</w:t>
+              <w:t xml:space="preserve">Tail (1 fold, post-fix)</w:t>
+            </w:r>
+          </w:p>
+        </w:tc>
+        <w:tc>
+          <w:tcPr/>
+          <w:p>
+            <w:pPr>
+              <w:pStyle w:val="Compact"/>
+            </w:pPr>
+            <w:r>
+              <w:t xml:space="preserve">0.0315</w:t>
+            </w:r>
+          </w:p>
+        </w:tc>
+        <w:tc>
+          <w:tcPr/>
+          <w:p>
+            <w:pPr>
+              <w:pStyle w:val="Compact"/>
+            </w:pPr>
+            <w:r>
+              <w:t xml:space="preserve">0.000</w:t>
+            </w:r>
+          </w:p>
+        </w:tc>
+        <w:tc>
+          <w:tcPr/>
+          <w:p>
+            <w:pPr>
+              <w:pStyle w:val="Compact"/>
+            </w:pPr>
+            <w:r>
+              <w:t xml:space="preserve">Train=[2016], val=[2017], test=[2018]; degenerate — see § 5.3.1</w:t>
             </w:r>
           </w:p>
         </w:tc>
       </w:tr>
     </w:tbl>
+    <w:bookmarkStart w:id="21" w:name="X84649e7f99ba233680d7a7c5eda495bb0d35d15"/>
+    <w:p>
+      <w:pPr>
+        <w:pStyle w:val="Heading3"/>
+      </w:pPr>
+      <w:r>
+        <w:t xml:space="preserve">5.3.1 The tail-split bug, fix, and why the post-fix numbers are still degenerate</w:t>
+      </w:r>
+    </w:p>
+    <w:p>
+      <w:pPr>
+        <w:pStyle w:val="FirstParagraph"/>
+      </w:pPr>
+      <w:r>
+        <w:rPr>
+          <w:b/>
+          <w:bCs/>
+        </w:rPr>
+        <w:t xml:space="preserve">Symptom.</w:t>
+      </w:r>
+      <w:r>
+        <w:t xml:space="preserve"> </w:t>
+      </w:r>
+      <w:r>
+        <w:t xml:space="preserve">First</w:t>
+      </w:r>
+      <w:r>
+        <w:t xml:space="preserve"> </w:t>
+      </w:r>
+      <w:r>
+        <w:rPr>
+          <w:rStyle w:val="VerbatimChar"/>
+        </w:rPr>
+        <w:t xml:space="preserve">student_loyo.py --strategy tail</w:t>
+      </w:r>
+      <w:r>
+        <w:t xml:space="preserve"> </w:t>
+      </w:r>
+      <w:r>
+        <w:t xml:space="preserve">run produced a</w:t>
+      </w:r>
+      <w:r>
+        <w:t xml:space="preserve"> </w:t>
+      </w:r>
+      <w:r>
+        <w:rPr>
+          <w:rStyle w:val="VerbatimChar"/>
+        </w:rPr>
+        <w:t xml:space="preserve">cv_report.json</w:t>
+      </w:r>
+      <w:r>
+        <w:t xml:space="preserve"> </w:t>
+      </w:r>
+      <w:r>
+        <w:t xml:space="preserve">with</w:t>
+      </w:r>
+      <w:r>
+        <w:t xml:space="preserve"> </w:t>
+      </w:r>
+      <w:r>
+        <w:rPr>
+          <w:rStyle w:val="VerbatimChar"/>
+        </w:rPr>
+        <w:t xml:space="preserve">train_years: []</w:t>
+      </w:r>
+      <w:r>
+        <w:t xml:space="preserve">, all three models</w:t>
+      </w:r>
+      <w:r>
+        <w:t xml:space="preserve"> </w:t>
+      </w:r>
+      <w:r>
+        <w:rPr>
+          <w:rStyle w:val="VerbatimChar"/>
+        </w:rPr>
+        <w:t xml:space="preserve">{"skipped": true}</w:t>
+      </w:r>
+      <w:r>
+        <w:t xml:space="preserve">, and an empty</w:t>
+      </w:r>
+      <w:r>
+        <w:t xml:space="preserve"> </w:t>
+      </w:r>
+      <w:r>
+        <w:rPr>
+          <w:rStyle w:val="VerbatimChar"/>
+        </w:rPr>
+        <w:t xml:space="preserve">cv_summary.csv</w:t>
+      </w:r>
+      <w:r>
+        <w:t xml:space="preserve">.</w:t>
+      </w:r>
+    </w:p>
     <w:p>
       <w:pPr>
         <w:pStyle w:val="BodyText"/>
@@ -3336,14 +3429,357 @@
           <w:b/>
           <w:bCs/>
         </w:rPr>
-        <w:t xml:space="preserve">Verdict</w:t>
-      </w:r>
-      <w:r>
-        <w:t xml:space="preserve">: don’t use annual-label training until S2 archives go back further (or until you augment with non-S2 sources like Landsat for 2013-2015).</w:t>
+        <w:t xml:space="preserve">Root cause.</w:t>
+      </w:r>
+      <w:r>
+        <w:t xml:space="preserve"> </w:t>
+      </w:r>
+      <w:r>
+        <w:rPr>
+          <w:rStyle w:val="VerbatimChar"/>
+        </w:rPr>
+        <w:t xml:space="preserve">tail_split()</w:t>
+      </w:r>
+      <w:r>
+        <w:t xml:space="preserve"> </w:t>
+      </w:r>
+      <w:r>
+        <w:t xml:space="preserve">in</w:t>
+      </w:r>
+      <w:r>
+        <w:t xml:space="preserve"> </w:t>
+      </w:r>
+      <w:r>
+        <w:rPr>
+          <w:rStyle w:val="VerbatimChar"/>
+        </w:rPr>
+        <w:t xml:space="preserve">pipeline/splits.py</w:t>
+      </w:r>
+      <w:r>
+        <w:t xml:space="preserve"> </w:t>
+      </w:r>
+      <w:r>
+        <w:t xml:space="preserve">was hard-coded to:</w:t>
+      </w:r>
+    </w:p>
+    <w:p>
+      <w:pPr>
+        <w:pStyle w:val="SourceCode"/>
+      </w:pPr>
+      <w:r>
+        <w:rPr>
+          <w:rStyle w:val="VerbatimChar"/>
+        </w:rPr>
+        <w:t xml:space="preserve">train_years = (2013, 2014, 2015), val_years = (2016,), test_years = (2017, 2018)</w:t>
+      </w:r>
+    </w:p>
+    <w:p>
+      <w:pPr>
+        <w:pStyle w:val="FirstParagraph"/>
+      </w:pPr>
+      <w:r>
+        <w:t xml:space="preserve">reflecting the documented Forillon boom-bust-recovery-crash cycle. Sentinel-2A only became operational in 2016, so your real GEE export covers</w:t>
+      </w:r>
+      <w:r>
+        <w:t xml:space="preserve"> </w:t>
+      </w:r>
+      <w:r>
+        <w:rPr>
+          <w:b/>
+          <w:bCs/>
+        </w:rPr>
+        <w:t xml:space="preserve">only 2016, 2017, 2018</w:t>
+      </w:r>
+      <w:r>
+        <w:t xml:space="preserve">. The intersection with the hard-coded</w:t>
+      </w:r>
+      <w:r>
+        <w:t xml:space="preserve"> </w:t>
+      </w:r>
+      <w:r>
+        <w:rPr>
+          <w:rStyle w:val="VerbatimChar"/>
+        </w:rPr>
+        <w:t xml:space="preserve">train_years</w:t>
+      </w:r>
+      <w:r>
+        <w:t xml:space="preserve"> </w:t>
+      </w:r>
+      <w:r>
+        <w:t xml:space="preserve">is empty → 0 training rows →</w:t>
+      </w:r>
+      <w:r>
+        <w:t xml:space="preserve"> </w:t>
+      </w:r>
+      <w:r>
+        <w:rPr>
+          <w:rStyle w:val="VerbatimChar"/>
+        </w:rPr>
+        <w:t xml:space="preserve">len(sub_tr) &lt; 10</w:t>
+      </w:r>
+      <w:r>
+        <w:t xml:space="preserve"> </w:t>
+      </w:r>
+      <w:r>
+        <w:t xml:space="preserve">guard fires → all three models silently skipped →</w:t>
+      </w:r>
+      <w:r>
+        <w:t xml:space="preserve"> </w:t>
+      </w:r>
+      <w:r>
+        <w:rPr>
+          <w:rStyle w:val="VerbatimChar"/>
+        </w:rPr>
+        <w:t xml:space="preserve">cv_summary.csv</w:t>
+      </w:r>
+      <w:r>
+        <w:t xml:space="preserve"> </w:t>
+      </w:r>
+      <w:r>
+        <w:t xml:space="preserve">written with header but no data rows.</w:t>
+      </w:r>
+    </w:p>
+    <w:p>
+      <w:pPr>
+        <w:pStyle w:val="BodyText"/>
+      </w:pPr>
+      <w:r>
+        <w:rPr>
+          <w:b/>
+          <w:bCs/>
+        </w:rPr>
+        <w:t xml:space="preserve">Fix.</w:t>
+      </w:r>
+      <w:r>
+        <w:t xml:space="preserve"> </w:t>
+      </w:r>
+      <w:r>
+        <w:rPr>
+          <w:rStyle w:val="VerbatimChar"/>
+        </w:rPr>
+        <w:t xml:space="preserve">tail_split()</w:t>
+      </w:r>
+      <w:r>
+        <w:t xml:space="preserve"> </w:t>
+      </w:r>
+      <w:r>
+        <w:t xml:space="preserve">now detects when its documented train years aren’t present in</w:t>
+      </w:r>
+      <w:r>
+        <w:t xml:space="preserve"> </w:t>
+      </w:r>
+      <w:r>
+        <w:rPr>
+          <w:rStyle w:val="VerbatimChar"/>
+        </w:rPr>
+        <w:t xml:space="preserve">df['year']</w:t>
+      </w:r>
+      <w:r>
+        <w:t xml:space="preserve"> </w:t>
+      </w:r>
+      <w:r>
+        <w:t xml:space="preserve">and auto-falls back to splitting whatever IS available: earliest year(s) → train, middle → val, latest year(s) → test. It prints a console warning so the user knows the fallback fired. With your 2016-2018 features the warning reads:</w:t>
+      </w:r>
+    </w:p>
+    <w:p>
+      <w:pPr>
+        <w:pStyle w:val="SourceCode"/>
+      </w:pPr>
+      <w:r>
+        <w:rPr>
+          <w:rStyle w:val="VerbatimChar"/>
+        </w:rPr>
+        <w:t xml:space="preserve">[tail_split] Documented 2013-18 split unavailable. Using fallback for years [2016, 2017, 2018]:</w:t>
+      </w:r>
+      <w:r>
+        <w:br/>
+      </w:r>
+      <w:r>
+        <w:rPr>
+          <w:rStyle w:val="VerbatimChar"/>
+        </w:rPr>
+        <w:t xml:space="preserve">  train=[2016]  val=[2017]  test=[2018]</w:t>
+      </w:r>
+    </w:p>
+    <w:p>
+      <w:pPr>
+        <w:pStyle w:val="FirstParagraph"/>
+      </w:pPr>
+      <w:r>
+        <w:rPr>
+          <w:b/>
+          <w:bCs/>
+        </w:rPr>
+        <w:t xml:space="preserve">Why the post-fix numbers are still degenerate.</w:t>
+      </w:r>
+      <w:r>
+        <w:t xml:space="preserve"> </w:t>
+      </w:r>
+      <w:r>
+        <w:t xml:space="preserve">Even with a non-empty training set, annual labels collapse the problem. With one row per year:</w:t>
+      </w:r>
+    </w:p>
+    <w:p>
+      <w:pPr>
+        <w:pStyle w:val="SourceCode"/>
+      </w:pPr>
+      <w:r>
+        <w:rPr>
+          <w:rStyle w:val="VerbatimChar"/>
+        </w:rPr>
+        <w:t xml:space="preserve">year:      2016        2017      2018</w:t>
+      </w:r>
+      <w:r>
+        <w:br/>
+      </w:r>
+      <w:r>
+        <w:rPr>
+          <w:rStyle w:val="VerbatimChar"/>
+        </w:rPr>
+        <w:t xml:space="preserve">fold:      train       val       test</w:t>
+      </w:r>
+      <w:r>
+        <w:br/>
+      </w:r>
+      <w:r>
+        <w:rPr>
+          <w:rStyle w:val="VerbatimChar"/>
+        </w:rPr>
+        <w:t xml:space="preserve">decline_flag:   0          1         0</w:t>
+      </w:r>
+      <w:r>
+        <w:br/>
+      </w:r>
+      <w:r>
+        <w:rPr>
+          <w:rStyle w:val="VerbatimChar"/>
+        </w:rPr>
+        <w:t xml:space="preserve">GPI_annual:   0.466      0.487     0.497</w:t>
+      </w:r>
+      <w:r>
+        <w:br/>
+      </w:r>
+      <w:r>
+        <w:rPr>
+          <w:rStyle w:val="VerbatimChar"/>
+        </w:rPr>
+        <w:t xml:space="preserve">stress:       cold       cold      cold</w:t>
+      </w:r>
+    </w:p>
+    <w:p>
+      <w:pPr>
+        <w:pStyle w:val="FirstParagraph"/>
+      </w:pPr>
+      <w:r>
+        <w:t xml:space="preserve">The student trained on</w:t>
+      </w:r>
+      <w:r>
+        <w:t xml:space="preserve"> </w:t>
+      </w:r>
+      <w:r>
+        <w:rPr>
+          <w:rStyle w:val="VerbatimChar"/>
+        </w:rPr>
+        <w:t xml:space="preserve">decline_flag = 0</w:t>
+      </w:r>
+      <w:r>
+        <w:t xml:space="preserve"> </w:t>
+      </w:r>
+      <w:r>
+        <w:t xml:space="preserve">for all 216 train pixels is asked to predict</w:t>
+      </w:r>
+      <w:r>
+        <w:t xml:space="preserve"> </w:t>
+      </w:r>
+      <w:r>
+        <w:rPr>
+          <w:rStyle w:val="VerbatimChar"/>
+        </w:rPr>
+        <w:t xml:space="preserve">decline_flag = 0</w:t>
+      </w:r>
+      <w:r>
+        <w:t xml:space="preserve"> </w:t>
+      </w:r>
+      <w:r>
+        <w:t xml:space="preserve">for all 30,074 test pixels — a degenerate</w:t>
+      </w:r>
+      <w:r>
+        <w:t xml:space="preserve"> </w:t>
+      </w:r>
+      <w:r>
+        <w:t xml:space="preserve">“always output 0”</w:t>
+      </w:r>
+      <w:r>
+        <w:t xml:space="preserve"> </w:t>
+      </w:r>
+      <w:r>
+        <w:t xml:space="preserve">win.</w:t>
+      </w:r>
+      <w:r>
+        <w:t xml:space="preserve"> </w:t>
+      </w:r>
+      <w:r>
+        <w:rPr>
+          <w:rStyle w:val="VerbatimChar"/>
+          <w:b/>
+          <w:bCs/>
+        </w:rPr>
+        <w:t xml:space="preserve">decline_mae = 0.0</w:t>
+      </w:r>
+      <w:r>
+        <w:rPr>
+          <w:b/>
+          <w:bCs/>
+        </w:rPr>
+        <w:t xml:space="preserve"> </w:t>
+      </w:r>
+      <w:r>
+        <w:rPr>
+          <w:b/>
+          <w:bCs/>
+        </w:rPr>
+        <w:t xml:space="preserve">is not real predictive skill</w:t>
+      </w:r>
+      <w:r>
+        <w:t xml:space="preserve">, it’s the consequence of zero label variance in both train and test. Same logic applies to GPI (near-constant annual values 0.47-0.50) and stress (only</w:t>
+      </w:r>
+      <w:r>
+        <w:t xml:space="preserve"> </w:t>
+      </w:r>
+      <w:r>
+        <w:rPr>
+          <w:rStyle w:val="VerbatimChar"/>
+        </w:rPr>
+        <w:t xml:space="preserve">cold</w:t>
+      </w:r>
+      <w:r>
+        <w:t xml:space="preserve"> </w:t>
+      </w:r>
+      <w:r>
+        <w:t xml:space="preserve">ever appears).</w:t>
+      </w:r>
+    </w:p>
+    <w:p>
+      <w:pPr>
+        <w:pStyle w:val="BodyText"/>
+      </w:pPr>
+      <w:r>
+        <w:rPr>
+          <w:b/>
+          <w:bCs/>
+        </w:rPr>
+        <w:t xml:space="preserve">Verdict.</w:t>
+      </w:r>
+      <w:r>
+        <w:t xml:space="preserve"> </w:t>
+      </w:r>
+      <w:r>
+        <w:t xml:space="preserve">The fix prevents the silent-failure failure mode (empty report). It doesn’t fix the structural issue: 6 annual labels × 3 available years is too small for the LOYO/forward/tail framework to do real work. Use the window-level student (§ 5.2) for headline metrics. The annual student becomes useful when one of these is true: S2 archives extend backward (Landsat-8 fusion for 2013-2015), or quadrat-level coordinates let us assign per-pixel annual cover labels (turning 6 labels into hundreds-of-thousands).</w:t>
       </w:r>
     </w:p>
     <w:bookmarkEnd w:id="21"/>
-    <w:bookmarkStart w:id="22" w:name="pan-atlantic-inference-on-antigonish"/>
+    <w:bookmarkEnd w:id="22"/>
+    <w:bookmarkStart w:id="23" w:name="pan-atlantic-inference-on-antigonish"/>
     <w:p>
       <w:pPr>
         <w:pStyle w:val="Heading2"/>
@@ -3647,9 +4083,9 @@
         <w:t xml:space="preserve">of the annual cycle even though it’s never seen this latitude.</w:t>
       </w:r>
     </w:p>
-    <w:bookmarkEnd w:id="22"/>
     <w:bookmarkEnd w:id="23"/>
-    <w:bookmarkStart w:id="35" w:name="visualisation-by-visualisation-reading"/>
+    <w:bookmarkEnd w:id="24"/>
+    <w:bookmarkStart w:id="36" w:name="visualisation-by-visualisation-reading"/>
     <w:p>
       <w:pPr>
         <w:pStyle w:val="Heading1"/>
@@ -3678,7 +4114,7 @@
         <w:t xml:space="preserve">. Each tells a specific diagnostic story.</w:t>
       </w:r>
     </w:p>
-    <w:bookmarkStart w:id="24" w:name="teacher-diagnostics-01-04"/>
+    <w:bookmarkStart w:id="25" w:name="teacher-diagnostics-01-04"/>
     <w:p>
       <w:pPr>
         <w:pStyle w:val="Heading2"/>
@@ -3787,8 +4223,8 @@
         <w:t xml:space="preserve">GPI is roughly bimodal per site (winter trough + summer peak). Decline-prob is heavily zero-inflated. Stress count bar shows ~64 % cold dominance.</w:t>
       </w:r>
     </w:p>
-    <w:bookmarkEnd w:id="24"/>
-    <w:bookmarkStart w:id="25" w:name="feature-diagnostics-05-07"/>
+    <w:bookmarkEnd w:id="25"/>
+    <w:bookmarkStart w:id="26" w:name="feature-diagnostics-05-07"/>
     <w:p>
       <w:pPr>
         <w:pStyle w:val="Heading2"/>
@@ -3876,8 +4312,8 @@
         <w:t xml:space="preserve">Three spatial clusters at the expected lat/lon for Ouest (NW), Marais (NE), Sud (SE) — confirms the GEE polygons captured the intended sub-sites.</w:t>
       </w:r>
     </w:p>
-    <w:bookmarkEnd w:id="25"/>
-    <w:bookmarkStart w:id="26" w:name="student-interpretability-08-10-21-22"/>
+    <w:bookmarkEnd w:id="26"/>
+    <w:bookmarkStart w:id="27" w:name="student-interpretability-08-10-21-22"/>
     <w:p>
       <w:pPr>
         <w:pStyle w:val="Heading2"/>
@@ -4103,8 +4539,8 @@
         <w:t xml:space="preserve">PD for B3_mean is monotonically increasing (more green → higher GPI). PD for B2_mean is monotonically decreasing (more blue → lower GPI). Both match ecological intuition.</w:t>
       </w:r>
     </w:p>
-    <w:bookmarkEnd w:id="26"/>
-    <w:bookmarkStart w:id="27" w:name="calibration-discrimination-11-14-20"/>
+    <w:bookmarkEnd w:id="27"/>
+    <w:bookmarkStart w:id="28" w:name="calibration-discrimination-11-14-20"/>
     <w:p>
       <w:pPr>
         <w:pStyle w:val="Heading2"/>
@@ -4277,8 +4713,8 @@
         <w:t xml:space="preserve">with ground-truth observations from a non-Forillon region.</w:t>
       </w:r>
     </w:p>
-    <w:bookmarkEnd w:id="27"/>
-    <w:bookmarkStart w:id="28" w:name="overall-performance-15"/>
+    <w:bookmarkEnd w:id="28"/>
+    <w:bookmarkStart w:id="29" w:name="overall-performance-15"/>
     <w:p>
       <w:pPr>
         <w:pStyle w:val="Heading2"/>
@@ -4309,8 +4745,8 @@
         <w:t xml:space="preserve">Side-by-side val vs test for all metrics. Visualises the spatial-vs-temporal generalisation gap at a glance: spatial transfer is near-perfect, temporal transfer degrades 10–40 % depending on metric.</w:t>
       </w:r>
     </w:p>
-    <w:bookmarkEnd w:id="28"/>
-    <w:bookmarkStart w:id="29" w:name="spatial-outputs-16-17"/>
+    <w:bookmarkEnd w:id="29"/>
+    <w:bookmarkStart w:id="30" w:name="spatial-outputs-16-17"/>
     <w:p>
       <w:pPr>
         <w:pStyle w:val="Heading2"/>
@@ -4363,8 +4799,8 @@
         <w:t xml:space="preserve">Two-panel scatter showing student predictions on x-axis, teacher labels on y-axis, across the full dataset. GPI tracks the y=x line tightly. Decline shows more dispersion at extremes.</w:t>
       </w:r>
     </w:p>
-    <w:bookmarkEnd w:id="29"/>
-    <w:bookmarkStart w:id="30" w:name="tracking-and-residuals-18-19-26"/>
+    <w:bookmarkEnd w:id="30"/>
+    <w:bookmarkStart w:id="31" w:name="tracking-and-residuals-18-19-26"/>
     <w:p>
       <w:pPr>
         <w:pStyle w:val="Heading2"/>
@@ -4439,8 +4875,8 @@
         <w:t xml:space="preserve">GPI MAE peaks in summer months (Jul-Aug) — the transition zone where seasonal change is steepest is hardest to fit. Decline MAE peaks in spring (Apr) and late summer (Aug) — the windows where decline_prob actually changes (i.e., when the alarm is being raised or cancelled).</w:t>
       </w:r>
     </w:p>
-    <w:bookmarkEnd w:id="30"/>
-    <w:bookmarkStart w:id="31" w:name="ood-detection-23"/>
+    <w:bookmarkEnd w:id="31"/>
+    <w:bookmarkStart w:id="32" w:name="ood-detection-23"/>
     <w:p>
       <w:pPr>
         <w:pStyle w:val="Heading2"/>
@@ -4471,8 +4907,8 @@
         <w:t xml:space="preserve">Left panel: distributions overlap heavily across train/val/test, all centred ≈ 1.0 with 95th-percentile threshold ≈ 3.0. Right panel: Sud has a slightly wider distance distribution than Ouest/Marais — exactly the right signal for the spatial validation hold-out. This is the mechanism that produces the 100 % OOD flag for Antigonish (a region 330 km south).</w:t>
       </w:r>
     </w:p>
-    <w:bookmarkEnd w:id="31"/>
-    <w:bookmarkStart w:id="32" w:name="operational-outputs-24"/>
+    <w:bookmarkEnd w:id="32"/>
+    <w:bookmarkStart w:id="33" w:name="operational-outputs-24"/>
     <w:p>
       <w:pPr>
         <w:pStyle w:val="Heading2"/>
@@ -4503,8 +4939,8 @@
         <w:t xml:space="preserve">Top panel: bed-level decline probability over time per site, with Low/Medium/High dashed thresholds. The signal is bimodal (often near 0 or near 1) — reflects the underlying teacher’s bimodality. Bottom panel: yearly risk-tier composition; ~70 % Low, ~25 % High, ~5 % Medium. The 2013 partial year is an artifact of date range.</w:t>
       </w:r>
     </w:p>
-    <w:bookmarkEnd w:id="32"/>
-    <w:bookmarkStart w:id="33" w:name="learning-dynamics-25"/>
+    <w:bookmarkEnd w:id="33"/>
+    <w:bookmarkStart w:id="34" w:name="learning-dynamics-25"/>
     <w:p>
       <w:pPr>
         <w:pStyle w:val="Heading2"/>
@@ -4564,8 +5000,8 @@
         <w:t xml:space="preserve">, not a model-capacity problem. To improve, add data (more sites, more years), not capacity.</w:t>
       </w:r>
     </w:p>
-    <w:bookmarkEnd w:id="33"/>
-    <w:bookmarkStart w:id="34" w:name="stress-trajectory-27"/>
+    <w:bookmarkEnd w:id="34"/>
+    <w:bookmarkStart w:id="35" w:name="stress-trajectory-27"/>
     <w:p>
       <w:pPr>
         <w:pStyle w:val="Heading2"/>
@@ -4596,9 +5032,9 @@
         <w:t xml:space="preserve">Per-site time-vs-class heatmaps. Clean annual rhythm visible: cold (Dec-Apr), light (transition seasons), senescence (Sep-Nov). All three sites essentially identical (same env data). Pattern is near-binary because the classifier outputs sharp probabilities on real S2 data — well-separated classes when given enough spectral features.</w:t>
       </w:r>
     </w:p>
-    <w:bookmarkEnd w:id="34"/>
     <w:bookmarkEnd w:id="35"/>
-    <w:bookmarkStart w:id="37" w:name="limitations-caveats-and-next-steps"/>
+    <w:bookmarkEnd w:id="36"/>
+    <w:bookmarkStart w:id="38" w:name="limitations-caveats-and-next-steps"/>
     <w:p>
       <w:pPr>
         <w:pStyle w:val="Heading1"/>
@@ -4711,7 +5147,34 @@
               <w:pStyle w:val="Compact"/>
             </w:pPr>
             <w:r>
-              <w:t xml:space="preserve">Annual-label student is structurally crippled; tail strategy fails</w:t>
+              <w:t xml:space="preserve">Annual-label student is structurally crippled — tail strategy used to silently fail (zero-row train set), now produces degenerate</w:t>
+            </w:r>
+            <w:r>
+              <w:t xml:space="preserve"> </w:t>
+            </w:r>
+            <w:r>
+              <w:t xml:space="preserve">“always-0”</w:t>
+            </w:r>
+            <w:r>
+              <w:t xml:space="preserve"> </w:t>
+            </w:r>
+            <w:r>
+              <w:t xml:space="preserve">predictions after the</w:t>
+            </w:r>
+            <w:r>
+              <w:t xml:space="preserve"> </w:t>
+            </w:r>
+            <w:r>
+              <w:rPr>
+                <w:rStyle w:val="VerbatimChar"/>
+              </w:rPr>
+              <w:t xml:space="preserve">tail_split</w:t>
+            </w:r>
+            <w:r>
+              <w:t xml:space="preserve"> </w:t>
+            </w:r>
+            <w:r>
+              <w:t xml:space="preserve">fallback fix</w:t>
             </w:r>
           </w:p>
         </w:tc>
@@ -4895,7 +5358,7 @@
         </w:tc>
       </w:tr>
     </w:tbl>
-    <w:bookmarkStart w:id="36" w:name="recommended-next-milestones"/>
+    <w:bookmarkStart w:id="37" w:name="recommended-next-milestones"/>
     <w:p>
       <w:pPr>
         <w:pStyle w:val="Heading2"/>
@@ -5013,9 +5476,9 @@
         <w:t xml:space="preserve">instead of a single trained model. The mean of 6 LOYO models is more robust to outlier years than any single year-trained model.</w:t>
       </w:r>
     </w:p>
-    <w:bookmarkEnd w:id="36"/>
     <w:bookmarkEnd w:id="37"/>
-    <w:bookmarkStart w:id="38" w:name="the-bottom-line"/>
+    <w:bookmarkEnd w:id="38"/>
+    <w:bookmarkStart w:id="39" w:name="the-bottom-line"/>
     <w:p>
       <w:pPr>
         <w:pStyle w:val="Heading1"/>
@@ -5085,7 +5548,7 @@
         <w:t xml:space="preserve">This is the right shape of a production early-warning system: a small expensive expert pipeline (the teacher) bottling knowledge that a fast cheap model (the student) can apply over the whole continent.</w:t>
       </w:r>
     </w:p>
-    <w:bookmarkEnd w:id="38"/>
+    <w:bookmarkEnd w:id="39"/>
     <w:sectPr>
       <w:footnotePr>
         <w:numRestart w:val="eachSect"/>

</xml_diff>